<commit_message>
folder creation for txt files after ndarray
</commit_message>
<xml_diff>
--- a/part 17.docx
+++ b/part 17.docx
@@ -27,6 +27,114 @@
         </w:rPr>
         <w:t xml:space="preserve">Date: 5-feb-2026 recording </w:t>
       </w:r>
+    </w:p>
+    <w:p>
+      <w:pPr>
+        <w:rPr>
+          <w:lang w:val="en-US"/>
+        </w:rPr>
+      </w:pPr>
+      <w:r>
+        <w:rPr>
+          <w:lang w:val="en-US"/>
+        </w:rPr>
+        <w:t xml:space="preserve">Date: 7-feb-2026 recording </w:t>
+      </w:r>
+    </w:p>
+    <w:p>
+      <w:pPr>
+        <w:rPr>
+          <w:lang w:val="en-US"/>
+        </w:rPr>
+      </w:pPr>
+      <w:r>
+        <w:rPr>
+          <w:lang w:val="en-US"/>
+        </w:rPr>
+        <w:t xml:space="preserve">Date: 10-feb-2026 recording </w:t>
+      </w:r>
+    </w:p>
+    <w:p>
+      <w:pPr>
+        <w:rPr>
+          <w:lang w:val="en-US"/>
+        </w:rPr>
+      </w:pPr>
+      <w:r>
+        <w:rPr>
+          <w:lang w:val="en-US"/>
+        </w:rPr>
+        <w:t xml:space="preserve">Date: 12-feb-2026 recording </w:t>
+      </w:r>
+    </w:p>
+    <w:p>
+      <w:pPr>
+        <w:rPr>
+          <w:lang w:val="en-US"/>
+        </w:rPr>
+      </w:pPr>
+      <w:r>
+        <w:rPr>
+          <w:lang w:val="en-US"/>
+        </w:rPr>
+        <w:t xml:space="preserve">Date: 17-feb-2026 recording </w:t>
+      </w:r>
+    </w:p>
+    <w:p>
+      <w:pPr>
+        <w:rPr>
+          <w:lang w:val="en-US"/>
+        </w:rPr>
+      </w:pPr>
+      <w:r>
+        <w:rPr>
+          <w:lang w:val="en-US"/>
+        </w:rPr>
+        <w:t xml:space="preserve">Date: 19-feb-2026 recording </w:t>
+      </w:r>
+    </w:p>
+    <w:p>
+      <w:pPr>
+        <w:pBdr>
+          <w:bottom w:val="dotted" w:sz="24" w:space="1" w:color="auto"/>
+        </w:pBdr>
+        <w:rPr>
+          <w:lang w:val="en-US"/>
+        </w:rPr>
+      </w:pPr>
+      <w:r>
+        <w:rPr>
+          <w:lang w:val="en-US"/>
+        </w:rPr>
+        <w:t xml:space="preserve">Date: 21-feb-2026 recording </w:t>
+      </w:r>
+    </w:p>
+    <w:p>
+      <w:pPr>
+        <w:rPr>
+          <w:lang w:val="en-US"/>
+        </w:rPr>
+      </w:pPr>
+      <w:r>
+        <w:rPr>
+          <w:lang w:val="en-US"/>
+        </w:rPr>
+        <w:t>Till part16 we have created word files , but after part 16 we have recordings and we will create txt file as summary.</w:t>
+      </w:r>
+    </w:p>
+    <w:p>
+      <w:pPr>
+        <w:rPr>
+          <w:lang w:val="en-US"/>
+        </w:rPr>
+      </w:pPr>
+    </w:p>
+    <w:p>
+      <w:pPr>
+        <w:rPr>
+          <w:lang w:val="en-US"/>
+        </w:rPr>
+      </w:pPr>
     </w:p>
     <w:p>
       <w:pPr>
@@ -4384,7 +4492,7 @@
   <a:extraClrSchemeLst/>
   <a:extLst>
     <a:ext uri="{05A4C25C-085E-4340-85A3-A5531E510DB2}">
-      <thm15:themeFamily xmlns="" xmlns:thm15="http://schemas.microsoft.com/office/thememl/2012/main" name="Office Theme" id="{62F939B6-93AF-4DB8-9C6B-D6C7DFDC589F}" vid="{4A3C46E8-61CC-4603-A589-7422A47A8E4A}"/>
+      <thm15:themeFamily xmlns:thm15="http://schemas.microsoft.com/office/thememl/2012/main" xmlns="" name="Office Theme" id="{62F939B6-93AF-4DB8-9C6B-D6C7DFDC589F}" vid="{4A3C46E8-61CC-4603-A589-7422A47A8E4A}"/>
     </a:ext>
   </a:extLst>
 </a:theme>

</xml_diff>